<commit_message>
docs(mock-interview): SWAP D2/D3 — D2 = Service, D3 = Probes
Học theo thực tế anh đã làm D2 ngày 2026-05-12 (Service & Networking).
Probes dời sang D3 (2026-05-13).

Co-Authored-By: Claude Opus 4.7 (1M context) <noreply@anthropic.com>
</commit_message>
<xml_diff>
--- a/docs/mock-interview/roadmap-2-month.docx
+++ b/docs/mock-interview/roadmap-2-month.docx
@@ -347,18 +347,18 @@
               <w:pStyle w:val="Compact"/>
             </w:pPr>
             <w:r>
-              <w:t xml:space="preserve">Probes</w:t>
-            </w:r>
-          </w:p>
-        </w:tc>
-        <w:tc>
-          <w:tcPr/>
-          <w:p>
-            <w:pPr>
-              <w:pStyle w:val="Compact"/>
-            </w:pPr>
-            <w:r>
-              <w:t xml:space="preserve">Q6-Q10: readiness vs liveness vs startup / HTTP/TCP/Exec / failureThreshold math / probe gây CrashLoop / sidecar race</w:t>
+              <w:t xml:space="preserve">Service + Networking ⬅ SWAPPED 2026-05-12</w:t>
+            </w:r>
+          </w:p>
+        </w:tc>
+        <w:tc>
+          <w:tcPr/>
+          <w:p>
+            <w:pPr>
+              <w:pStyle w:val="Compact"/>
+            </w:pPr>
+            <w:r>
+              <w:t xml:space="preserve">Q6-Q10: ClusterIP/NodePort/LoadBalancer + LBC IP mode / kube-proxy iptables vs IPVS / Endpoints vs EndpointSlice / DNS cluster.local + ndots / Headless StatefulSet</w:t>
             </w:r>
           </w:p>
         </w:tc>
@@ -403,18 +403,18 @@
               <w:pStyle w:val="Compact"/>
             </w:pPr>
             <w:r>
-              <w:t xml:space="preserve">Service + Endpoints</w:t>
-            </w:r>
-          </w:p>
-        </w:tc>
-        <w:tc>
-          <w:tcPr/>
-          <w:p>
-            <w:pPr>
-              <w:pStyle w:val="Compact"/>
-            </w:pPr>
-            <w:r>
-              <w:t xml:space="preserve">Q11-Q15: 4 type Service / kube-proxy iptables vs IPVS / Endpoints vs EndpointSlice v1.33+ / DNS cluster.local / Headless vs ClusterIP</w:t>
+              <w:t xml:space="preserve">Probes ⬅ SWAPPED 2026-05-12</w:t>
+            </w:r>
+          </w:p>
+        </w:tc>
+        <w:tc>
+          <w:tcPr/>
+          <w:p>
+            <w:pPr>
+              <w:pStyle w:val="Compact"/>
+            </w:pPr>
+            <w:r>
+              <w:t xml:space="preserve">Q11-Q15: readiness vs liveness vs startup / HTTP/TCP/Exec / failureThreshold math / probe gây CrashLoop / sidecar race</w:t>
             </w:r>
           </w:p>
         </w:tc>

</xml_diff>